<commit_message>
Portable start-prompt + fold working-style/git-deploy/sync rules into CLAUDE.md; add bash-mount-stale gotcha
</commit_message>
<xml_diff>
--- a/projects/erpnext_sbca/ERPNext_SBCA_Setup_Guide.docx
+++ b/projects/erpnext_sbca/ERPNext_SBCA_Setup_Guide.docx
@@ -5,10 +5,48 @@
     <w:p>
       <w:pPr>
         <w:shd w:fill="1F3864" w:val="clear"/>
-        <w:spacing w:after="0" w:before="0"/>
+        <w:spacing w:after="0" w:before="280"/>
+        <w:jc w:val="center"/>
       </w:pPr>
       <w:r>
-        <w:t xml:space="preserve"/>
+        <w:rPr>
+          <w:noProof/>
+        </w:rPr>
+        <w:drawing>
+          <wp:inline distT="0" distB="0" distL="0" distR="0">
+            <wp:extent cx="731520" cy="585216"/>
+            <wp:effectExtent l="0" t="0" r="0" b="0"/>
+            <wp:docPr id="100" name="NestERP Logo"/>
+            <wp:cNvGraphicFramePr>
+              <a:graphicFrameLocks xmlns:a="http://schemas.openxmlformats.org/drawingml/2006/main" noChangeAspect="1"/>
+            </wp:cNvGraphicFramePr>
+            <a:graphic xmlns:a="http://schemas.openxmlformats.org/drawingml/2006/main">
+              <a:graphicData uri="http://schemas.openxmlformats.org/drawingml/2006/picture">
+                <pic:pic xmlns:pic="http://schemas.openxmlformats.org/drawingml/2006/picture">
+                  <pic:nvPicPr>
+                    <pic:cNvPr id="100" name="NestERP Logo"/>
+                    <pic:cNvPicPr/>
+                  </pic:nvPicPr>
+                  <pic:blipFill>
+                    <a:blip r:embed="rId10"/>
+                    <a:stretch>
+                      <a:fillRect/>
+                    </a:stretch>
+                  </pic:blipFill>
+                  <pic:spPr>
+                    <a:xfrm>
+                      <a:off x="0" y="0"/>
+                      <a:ext cx="731520" cy="585216"/>
+                    </a:xfrm>
+                    <a:prstGeom prst="rect">
+                      <a:avLst/>
+                    </a:prstGeom>
+                  </pic:spPr>
+                </pic:pic>
+              </a:graphicData>
+            </a:graphic>
+          </wp:inline>
+        </w:drawing>
       </w:r>
     </w:p>
     <w:p>
@@ -26,7 +64,7 @@
           <w:sz w:val="52"/>
           <w:szCs w:val="52"/>
         </w:rPr>
-        <w:t xml:space="preserve">ERPNext SBCA Integration</w:t>
+        <w:t xml:space="preserve">NestERP SBCA Integration</w:t>
       </w:r>
     </w:p>
     <w:p>
@@ -126,7 +164,7 @@
           <w:sz w:val="22"/>
           <w:szCs w:val="22"/>
         </w:rPr>
-        <w:t xml:space="preserve">This guide walks through the complete first-time configuration of the ERPNext SBCA integration for a new client. Follow each section in order — the sequence matters because later steps depend on earlier ones being in place.</w:t>
+        <w:t xml:space="preserve">This guide walks through the complete first-time configuration of the NestERP SBCA integration for a new client. Follow each section in order — the sequence matters because later steps depend on earlier ones being in place.</w:t>
       </w:r>
     </w:p>
     <w:p>
@@ -152,7 +190,7 @@
           <w:sz w:val="20"/>
           <w:szCs w:val="20"/>
         </w:rPr>
-        <w:t xml:space="preserve">Before starting: confirm that the Pharoh middleware is deployed and accessible, and that you have the client's Sage Business Cloud Accounting credentials to hand.</w:t>
+        <w:t xml:space="preserve">Before starting: confirm that the NestERP API middleware is deployed and accessible, and that you have the client's Sage Business Cloud Accounting credentials to hand.</w:t>
       </w:r>
     </w:p>
     <w:p>
@@ -271,7 +309,7 @@
                 <w:sz w:val="20"/>
                 <w:szCs w:val="20"/>
               </w:rPr>
-              <w:t xml:space="preserve">Pharoh base URL</w:t>
+              <w:t xml:space="preserve">NestERP API base URL</w:t>
             </w:r>
           </w:p>
         </w:tc>
@@ -302,7 +340,7 @@
                 <w:sz w:val="20"/>
                 <w:szCs w:val="20"/>
               </w:rPr>
-              <w:t xml:space="preserve">From the Pharoh deployment (e.g. https://pharoh.yourdomain.co.za)</w:t>
+              <w:t xml:space="preserve">From the NestERP API deployment (e.g. https://nesterp-api.yourdomain.co.za)</w:t>
             </w:r>
           </w:p>
         </w:tc>
@@ -591,7 +629,7 @@
                 <w:sz w:val="20"/>
                 <w:szCs w:val="20"/>
               </w:rPr>
-              <w:t xml:space="preserve">ERPNext Company name</w:t>
+              <w:t xml:space="preserve">NestERP Company name</w:t>
             </w:r>
           </w:p>
         </w:tc>
@@ -622,7 +660,7 @@
                 <w:sz w:val="20"/>
                 <w:szCs w:val="20"/>
               </w:rPr>
-              <w:t xml:space="preserve">Must already exist in ERPNext before setup</w:t>
+              <w:t xml:space="preserve">Must already exist in NestERP before setup</w:t>
             </w:r>
           </w:p>
         </w:tc>
@@ -655,7 +693,7 @@
                 <w:sz w:val="20"/>
                 <w:szCs w:val="20"/>
               </w:rPr>
-              <w:t xml:space="preserve">ERPNext Warehouse</w:t>
+              <w:t xml:space="preserve">NestERP Warehouse</w:t>
             </w:r>
           </w:p>
         </w:tc>
@@ -686,7 +724,7 @@
                 <w:sz w:val="20"/>
                 <w:szCs w:val="20"/>
               </w:rPr>
-              <w:t xml:space="preserve">A warehouse must exist in ERPNext for the company</w:t>
+              <w:t xml:space="preserve">A warehouse must exist in NestERP for the company</w:t>
             </w:r>
           </w:p>
         </w:tc>
@@ -815,7 +853,7 @@
           <w:sz w:val="22"/>
           <w:szCs w:val="22"/>
         </w:rPr>
-        <w:t xml:space="preserve">Navigate to: ERPNext → Erpnext Sbca Settings. The page is divided into four tabs.</w:t>
+        <w:t xml:space="preserve">Navigate to: NestERP → Erpnext Sbca Settings. The page is divided into four tabs.</w:t>
       </w:r>
     </w:p>
     <w:p>
@@ -890,7 +928,7 @@
           <w:sz w:val="22"/>
           <w:szCs w:val="22"/>
         </w:rPr>
-        <w:t xml:space="preserve">Pharoh URL</w:t>
+        <w:t xml:space="preserve">NestERP API URL</w:t>
       </w:r>
     </w:p>
     <w:p>
@@ -904,7 +942,7 @@
           <w:sz w:val="22"/>
           <w:szCs w:val="22"/>
         </w:rPr>
-        <w:t xml:space="preserve">The base URL for the Pharoh middleware. All API calls are made to this address. Enter it without a trailing slash.</w:t>
+        <w:t xml:space="preserve">The base URL for the NestERP API middleware. All API calls are made to this address. Enter it without a trailing slash.</w:t>
       </w:r>
     </w:p>
     <w:p>
@@ -920,7 +958,7 @@
           <w:sz w:val="22"/>
           <w:szCs w:val="22"/>
         </w:rPr>
-        <w:t xml:space="preserve">Example: https://pharoh.clientdomain.co.za</w:t>
+        <w:t xml:space="preserve">Example: https://nesterp-api.clientdomain.co.za</w:t>
       </w:r>
     </w:p>
     <w:p>
@@ -1172,7 +1210,7 @@
                 <w:sz w:val="20"/>
                 <w:szCs w:val="20"/>
               </w:rPr>
-              <w:t xml:space="preserve">Imports Sage item categories as ERPNext Item Groups</w:t>
+              <w:t xml:space="preserve">Imports Sage item categories as NestERP Item Groups</w:t>
             </w:r>
           </w:p>
         </w:tc>
@@ -1267,7 +1305,7 @@
                 <w:sz w:val="20"/>
                 <w:szCs w:val="20"/>
               </w:rPr>
-              <w:t xml:space="preserve">Imports the full Sage item catalogue into ERPNext</w:t>
+              <w:t xml:space="preserve">Imports the full Sage item catalogue into NestERP</w:t>
             </w:r>
           </w:p>
         </w:tc>
@@ -1552,7 +1590,7 @@
                 <w:sz w:val="20"/>
                 <w:szCs w:val="20"/>
               </w:rPr>
-              <w:t xml:space="preserve">Updates ERPNext stock quantities from Sage</w:t>
+              <w:t xml:space="preserve">Updates NestERP stock quantities from Sage</w:t>
             </w:r>
           </w:p>
         </w:tc>
@@ -1742,7 +1780,7 @@
                 <w:sz w:val="20"/>
                 <w:szCs w:val="20"/>
               </w:rPr>
-              <w:t xml:space="preserve">Imports Sage suppliers as ERPNext Suppliers</w:t>
+              <w:t xml:space="preserve">Imports Sage suppliers as NestERP Suppliers</w:t>
             </w:r>
           </w:p>
         </w:tc>
@@ -1932,7 +1970,7 @@
                 <w:sz w:val="20"/>
                 <w:szCs w:val="20"/>
               </w:rPr>
-              <w:t xml:space="preserve">Imports Sage customers as ERPNext Customers</w:t>
+              <w:t xml:space="preserve">Imports Sage customers as NestERP Customers</w:t>
             </w:r>
           </w:p>
         </w:tc>
@@ -2122,7 +2160,7 @@
                 <w:sz w:val="20"/>
                 <w:szCs w:val="20"/>
               </w:rPr>
-              <w:t xml:space="preserve">Pulls open Sales Orders from Sage into ERPNext</w:t>
+              <w:t xml:space="preserve">Pulls open Sales Orders from Sage into NestERP</w:t>
             </w:r>
           </w:p>
         </w:tc>
@@ -2217,7 +2255,7 @@
                 <w:sz w:val="20"/>
                 <w:szCs w:val="20"/>
               </w:rPr>
-              <w:t xml:space="preserve">Pulls open Purchase Orders from Sage into ERPNext</w:t>
+              <w:t xml:space="preserve">Pulls open Purchase Orders from Sage into NestERP</w:t>
             </w:r>
           </w:p>
         </w:tc>
@@ -2312,7 +2350,7 @@
                 <w:sz w:val="20"/>
                 <w:szCs w:val="20"/>
               </w:rPr>
-              <w:t xml:space="preserve">Pushes price changes made in ERPNext back to Sage</w:t>
+              <w:t xml:space="preserve">Pushes price changes made in NestERP back to Sage</w:t>
             </w:r>
           </w:p>
         </w:tc>
@@ -2597,7 +2635,7 @@
                 <w:sz w:val="20"/>
                 <w:szCs w:val="20"/>
               </w:rPr>
-              <w:t xml:space="preserve">Sends a new SO to Sage when submitted in ERPNext</w:t>
+              <w:t xml:space="preserve">Sends a new SO to Sage when submitted in NestERP</w:t>
             </w:r>
           </w:p>
         </w:tc>
@@ -2692,7 +2730,7 @@
                 <w:sz w:val="20"/>
                 <w:szCs w:val="20"/>
               </w:rPr>
-              <w:t xml:space="preserve">Sends a new PO to Sage when submitted in ERPNext</w:t>
+              <w:t xml:space="preserve">Sends a new PO to Sage when submitted in NestERP</w:t>
             </w:r>
           </w:p>
         </w:tc>
@@ -3153,7 +3191,7 @@
           <w:sz w:val="22"/>
           <w:szCs w:val="22"/>
         </w:rPr>
-        <w:t xml:space="preserve">A child table with one row per ERPNext Company that needs to sync with Sage. Each row holds the credentials and settings for one company. Click the pencil icon on a row to edit all fields.</w:t>
+        <w:t xml:space="preserve">A child table with one row per NestERP Company that needs to sync with Sage. Each row holds the credentials and settings for one company. Click the pencil icon on a row to edit all fields.</w:t>
       </w:r>
     </w:p>
     <w:p>
@@ -3221,7 +3259,7 @@
           <w:sz w:val="22"/>
           <w:szCs w:val="22"/>
         </w:rPr>
-        <w:t xml:space="preserve">These tabs are used after the initial sync has run and accounts have been imported. They are used to map Sage accounts to ERPNext accounts and configure tax types. Leave these until the Connection tab is fully configured and the first account sync has completed.</w:t>
+        <w:t xml:space="preserve">These tabs are used after the initial sync has run and accounts have been imported. They are used to map Sage accounts to NestERP accounts and configure tax types. Leave these until the Connection tab is fully configured and the first account sync has completed.</w:t>
       </w:r>
     </w:p>
     <w:p>
@@ -3496,7 +3534,7 @@
                 <w:sz w:val="20"/>
                 <w:szCs w:val="20"/>
               </w:rPr>
-              <w:t xml:space="preserve">Link to the ERPNext Company this row applies to. Must exist before setup.</w:t>
+              <w:t xml:space="preserve">Link to the NestERP Company this row applies to. Must exist before setup.</w:t>
             </w:r>
           </w:p>
         </w:tc>
@@ -4541,7 +4579,7 @@
                 <w:sz w:val="20"/>
                 <w:szCs w:val="20"/>
               </w:rPr>
-              <w:t xml:space="preserve">The ERPNext warehouse where imported SO and PO items will be assigned. Must exist in ERPNext and belong to this company.</w:t>
+              <w:t xml:space="preserve">The NestERP warehouse where imported SO and PO items will be assigned. Must exist in NestERP and belong to this company.</w:t>
             </w:r>
           </w:p>
         </w:tc>
@@ -5292,7 +5330,7 @@
                 <w:sz w:val="22"/>
                 <w:szCs w:val="22"/>
               </w:rPr>
-              <w:t xml:space="preserve">Pharoh middleware is deployed and the swagger page loads</w:t>
+              <w:t xml:space="preserve">NestERP API middleware is deployed and the swagger page loads</w:t>
             </w:r>
           </w:p>
         </w:tc>
@@ -5323,7 +5361,7 @@
                 <w:sz w:val="20"/>
                 <w:szCs w:val="20"/>
               </w:rPr>
-              <w:t xml:space="preserve">Visit /swagger/index.html on the Pharoh URL</w:t>
+              <w:t xml:space="preserve">Visit /swagger/index.html on the NestERP API URL</w:t>
             </w:r>
           </w:p>
         </w:tc>
@@ -5388,7 +5426,7 @@
                 <w:sz w:val="22"/>
                 <w:szCs w:val="22"/>
               </w:rPr>
-              <w:t xml:space="preserve">ERPNext Company record exists for this client</w:t>
+              <w:t xml:space="preserve">NestERP Company record exists for this client</w:t>
             </w:r>
           </w:p>
         </w:tc>
@@ -5484,7 +5522,7 @@
                 <w:sz w:val="22"/>
                 <w:szCs w:val="22"/>
               </w:rPr>
-              <w:t xml:space="preserve">At least one Warehouse exists for the company in ERPNext</w:t>
+              <w:t xml:space="preserve">At least one Warehouse exists for the company in NestERP</w:t>
             </w:r>
           </w:p>
         </w:tc>
@@ -5921,7 +5959,7 @@
                 <w:sz w:val="22"/>
                 <w:szCs w:val="22"/>
               </w:rPr>
-              <w:t xml:space="preserve">Enter the Pharoh base URL in the URL field</w:t>
+              <w:t xml:space="preserve">Enter the NestERP API base URL in the URL field</w:t>
             </w:r>
           </w:p>
         </w:tc>
@@ -6178,7 +6216,7 @@
                 <w:sz w:val="22"/>
                 <w:szCs w:val="22"/>
               </w:rPr>
-              <w:t xml:space="preserve">Set Company to the ERPNext Company</w:t>
+              <w:t xml:space="preserve">Set Company to the NestERP Company</w:t>
             </w:r>
           </w:p>
         </w:tc>
@@ -7674,7 +7712,7 @@
                 <w:sz w:val="22"/>
                 <w:szCs w:val="22"/>
               </w:rPr>
-              <w:t xml:space="preserve">Confirm you are redirected back to ERPNext</w:t>
+              <w:t xml:space="preserve">Confirm you are redirected back to NestERP</w:t>
             </w:r>
           </w:p>
         </w:tc>
@@ -8416,7 +8454,7 @@
                 <w:sz w:val="22"/>
                 <w:szCs w:val="22"/>
               </w:rPr>
-              <w:t xml:space="preserve">Wait one scheduler cycle (~4 minutes) and confirm groups appear in ERPNext</w:t>
+              <w:t xml:space="preserve">Wait one scheduler cycle (~4 minutes) and confirm groups appear in NestERP</w:t>
             </w:r>
           </w:p>
         </w:tc>
@@ -9379,7 +9417,7 @@
                 <w:sz w:val="22"/>
                 <w:szCs w:val="22"/>
               </w:rPr>
-              <w:t xml:space="preserve">Confirm SOs and POs appear in ERPNext</w:t>
+              <w:t xml:space="preserve">Confirm SOs and POs appear in NestERP</w:t>
             </w:r>
           </w:p>
         </w:tc>
@@ -9463,7 +9501,7 @@
           <w:sz w:val="22"/>
           <w:szCs w:val="22"/>
         </w:rPr>
-        <w:t xml:space="preserve">Enable push triggers only after the pull sync has been confirmed working. Enable only the document types the client will be processing through ERPNext.</w:t>
+        <w:t xml:space="preserve">Enable push triggers only after the pull sync has been confirmed working. Enable only the document types the client will be processing through NestERP.</w:t>
       </w:r>
     </w:p>
     <w:p>
@@ -9677,7 +9715,7 @@
                 <w:sz w:val="20"/>
                 <w:szCs w:val="20"/>
               </w:rPr>
-              <w:t xml:space="preserve">If client raises SOs in ERPNext</w:t>
+              <w:t xml:space="preserve">If client raises SOs in NestERP</w:t>
             </w:r>
           </w:p>
         </w:tc>
@@ -9773,7 +9811,7 @@
                 <w:sz w:val="20"/>
                 <w:szCs w:val="20"/>
               </w:rPr>
-              <w:t xml:space="preserve">If client raises POs in ERPNext</w:t>
+              <w:t xml:space="preserve">If client raises POs in NestERP</w:t>
             </w:r>
           </w:p>
         </w:tc>
@@ -9869,7 +9907,7 @@
                 <w:sz w:val="20"/>
                 <w:szCs w:val="20"/>
               </w:rPr>
-              <w:t xml:space="preserve">If client invoices through ERPNext</w:t>
+              <w:t xml:space="preserve">If client invoices through NestERP</w:t>
             </w:r>
           </w:p>
         </w:tc>
@@ -9965,7 +10003,7 @@
                 <w:sz w:val="20"/>
                 <w:szCs w:val="20"/>
               </w:rPr>
-              <w:t xml:space="preserve">If client processes supplier invoices in ERPNext</w:t>
+              <w:t xml:space="preserve">If client processes supplier invoices in NestERP</w:t>
             </w:r>
           </w:p>
         </w:tc>
@@ -10222,7 +10260,7 @@
                 <w:sz w:val="22"/>
                 <w:szCs w:val="22"/>
               </w:rPr>
-              <w:t xml:space="preserve">Test each enabled push by submitting a test document in ERPNext</w:t>
+              <w:t xml:space="preserve">Test each enabled push by submitting a test document in NestERP</w:t>
             </w:r>
           </w:p>
         </w:tc>
@@ -10851,7 +10889,7 @@
                 <w:sz w:val="22"/>
                 <w:szCs w:val="22"/>
               </w:rPr>
-              <w:t xml:space="preserve">Walk client accountant through the Sage ↔ ERPNext Accounting Sync Guide</w:t>
+              <w:t xml:space="preserve">Walk client accountant through the Sage ↔ NestERP Accounting Sync Guide</w:t>
             </w:r>
           </w:p>
         </w:tc>
@@ -10947,7 +10985,7 @@
                 <w:sz w:val="22"/>
                 <w:szCs w:val="22"/>
               </w:rPr>
-              <w:t xml:space="preserve">Confirm client knows: stock items must originate in ERPNext</w:t>
+              <w:t xml:space="preserve">Confirm client knows: stock items must originate in NestERP</w:t>
             </w:r>
           </w:p>
         </w:tc>
@@ -11074,7 +11112,7 @@
                 <w:sz w:val="20"/>
                 <w:szCs w:val="20"/>
               </w:rPr>
-              <w:t xml:space="preserve">ERPNext is reconciled monthly</w:t>
+              <w:t xml:space="preserve">NestERP is reconciled monthly</w:t>
             </w:r>
           </w:p>
         </w:tc>
@@ -11684,7 +11722,7 @@
                 <w:sz w:val="20"/>
                 <w:szCs w:val="20"/>
               </w:rPr>
-              <w:t xml:space="preserve">The customer in ERPNext does not have a custom_sage_customer_id. Run a customer pull first.</w:t>
+              <w:t xml:space="preserve">The customer in NestERP does not have a custom_sage_customer_id. Run a customer pull first.</w:t>
             </w:r>
           </w:p>
         </w:tc>
@@ -12490,7 +12528,7 @@
                 <w:sz w:val="20"/>
                 <w:szCs w:val="20"/>
               </w:rPr>
-              <w:t xml:space="preserve">Fresh site — clean ERPNext data</w:t>
+              <w:t xml:space="preserve">Fresh site — clean NestERP data</w:t>
             </w:r>
           </w:p>
         </w:tc>
@@ -12586,7 +12624,7 @@
                 <w:sz w:val="20"/>
                 <w:szCs w:val="20"/>
               </w:rPr>
-              <w:t xml:space="preserve">Toggles, Pharoh URL, Last Order Sync Date</w:t>
+              <w:t xml:space="preserve">Toggles, NestERP API URL, Last Order Sync Date</w:t>
             </w:r>
           </w:p>
         </w:tc>
@@ -12651,7 +12689,7 @@
                 <w:sz w:val="22"/>
                 <w:szCs w:val="22"/>
               </w:rPr>
-              <w:t xml:space="preserve">Add a new Company Sage Integration row for the live ERPNext Company</w:t>
+              <w:t xml:space="preserve">Add a new Company Sage Integration row for the live NestERP Company</w:t>
             </w:r>
           </w:p>
         </w:tc>
@@ -12874,7 +12912,7 @@
                 <w:sz w:val="20"/>
                 <w:szCs w:val="20"/>
               </w:rPr>
-              <w:t xml:space="preserve">Must exist in the live ERPNext site</w:t>
+              <w:t xml:space="preserve">Must exist in the live NestERP site</w:t>
             </w:r>
           </w:p>
         </w:tc>
@@ -13689,7 +13727,7 @@
         <w:sz w:val="18"/>
         <w:szCs w:val="18"/>
       </w:rPr>
-      <w:t xml:space="preserve">ERPNext SBCA — New Client Setup Guide</w:t>
+      <w:t xml:space="preserve">NestERP SBCA — New Client Setup Guide</w:t>
     </w:r>
     <w:r>
       <w:rPr>

</xml_diff>

<commit_message>
WIP on this workstation before graphify pull
</commit_message>
<xml_diff>
--- a/projects/erpnext_sbca/ERPNext_SBCA_Setup_Guide.docx
+++ b/projects/erpnext_sbca/ERPNext_SBCA_Setup_Guide.docx
@@ -5,10 +5,48 @@
     <w:p>
       <w:pPr>
         <w:shd w:fill="1F3864" w:val="clear"/>
-        <w:spacing w:after="0" w:before="0"/>
+        <w:spacing w:after="0" w:before="280"/>
+        <w:jc w:val="center"/>
       </w:pPr>
       <w:r>
-        <w:t xml:space="preserve"/>
+        <w:rPr>
+          <w:noProof/>
+        </w:rPr>
+        <w:drawing>
+          <wp:inline distT="0" distB="0" distL="0" distR="0">
+            <wp:extent cx="731520" cy="585216"/>
+            <wp:effectExtent l="0" t="0" r="0" b="0"/>
+            <wp:docPr id="100" name="NestERP Logo"/>
+            <wp:cNvGraphicFramePr>
+              <a:graphicFrameLocks xmlns:a="http://schemas.openxmlformats.org/drawingml/2006/main" noChangeAspect="1"/>
+            </wp:cNvGraphicFramePr>
+            <a:graphic xmlns:a="http://schemas.openxmlformats.org/drawingml/2006/main">
+              <a:graphicData uri="http://schemas.openxmlformats.org/drawingml/2006/picture">
+                <pic:pic xmlns:pic="http://schemas.openxmlformats.org/drawingml/2006/picture">
+                  <pic:nvPicPr>
+                    <pic:cNvPr id="100" name="NestERP Logo"/>
+                    <pic:cNvPicPr/>
+                  </pic:nvPicPr>
+                  <pic:blipFill>
+                    <a:blip r:embed="rId10"/>
+                    <a:stretch>
+                      <a:fillRect/>
+                    </a:stretch>
+                  </pic:blipFill>
+                  <pic:spPr>
+                    <a:xfrm>
+                      <a:off x="0" y="0"/>
+                      <a:ext cx="731520" cy="585216"/>
+                    </a:xfrm>
+                    <a:prstGeom prst="rect">
+                      <a:avLst/>
+                    </a:prstGeom>
+                  </pic:spPr>
+                </pic:pic>
+              </a:graphicData>
+            </a:graphic>
+          </wp:inline>
+        </w:drawing>
       </w:r>
     </w:p>
     <w:p>
@@ -26,7 +64,7 @@
           <w:sz w:val="52"/>
           <w:szCs w:val="52"/>
         </w:rPr>
-        <w:t xml:space="preserve">ERPNext SBCA Integration</w:t>
+        <w:t xml:space="preserve">NestERP SBCA Integration</w:t>
       </w:r>
     </w:p>
     <w:p>
@@ -126,7 +164,7 @@
           <w:sz w:val="22"/>
           <w:szCs w:val="22"/>
         </w:rPr>
-        <w:t xml:space="preserve">This guide walks through the complete first-time configuration of the ERPNext SBCA integration for a new client. Follow each section in order — the sequence matters because later steps depend on earlier ones being in place.</w:t>
+        <w:t xml:space="preserve">This guide walks through the complete first-time configuration of the NestERP SBCA integration for a new client. Follow each section in order — the sequence matters because later steps depend on earlier ones being in place.</w:t>
       </w:r>
     </w:p>
     <w:p>
@@ -152,7 +190,7 @@
           <w:sz w:val="20"/>
           <w:szCs w:val="20"/>
         </w:rPr>
-        <w:t xml:space="preserve">Before starting: confirm that the Pharoh middleware is deployed and accessible, and that you have the client's Sage Business Cloud Accounting credentials to hand.</w:t>
+        <w:t xml:space="preserve">Before starting: confirm that the NestERP API middleware is deployed and accessible, and that you have the client's Sage Business Cloud Accounting credentials to hand.</w:t>
       </w:r>
     </w:p>
     <w:p>
@@ -271,7 +309,7 @@
                 <w:sz w:val="20"/>
                 <w:szCs w:val="20"/>
               </w:rPr>
-              <w:t xml:space="preserve">Pharoh base URL</w:t>
+              <w:t xml:space="preserve">NestERP API base URL</w:t>
             </w:r>
           </w:p>
         </w:tc>
@@ -302,7 +340,7 @@
                 <w:sz w:val="20"/>
                 <w:szCs w:val="20"/>
               </w:rPr>
-              <w:t xml:space="preserve">From the Pharoh deployment (e.g. https://pharoh.yourdomain.co.za)</w:t>
+              <w:t xml:space="preserve">From the NestERP API deployment (e.g. https://nesterp-api.yourdomain.co.za)</w:t>
             </w:r>
           </w:p>
         </w:tc>
@@ -591,7 +629,7 @@
                 <w:sz w:val="20"/>
                 <w:szCs w:val="20"/>
               </w:rPr>
-              <w:t xml:space="preserve">ERPNext Company name</w:t>
+              <w:t xml:space="preserve">NestERP Company name</w:t>
             </w:r>
           </w:p>
         </w:tc>
@@ -622,7 +660,7 @@
                 <w:sz w:val="20"/>
                 <w:szCs w:val="20"/>
               </w:rPr>
-              <w:t xml:space="preserve">Must already exist in ERPNext before setup</w:t>
+              <w:t xml:space="preserve">Must already exist in NestERP before setup</w:t>
             </w:r>
           </w:p>
         </w:tc>
@@ -655,7 +693,7 @@
                 <w:sz w:val="20"/>
                 <w:szCs w:val="20"/>
               </w:rPr>
-              <w:t xml:space="preserve">ERPNext Warehouse</w:t>
+              <w:t xml:space="preserve">NestERP Warehouse</w:t>
             </w:r>
           </w:p>
         </w:tc>
@@ -686,7 +724,7 @@
                 <w:sz w:val="20"/>
                 <w:szCs w:val="20"/>
               </w:rPr>
-              <w:t xml:space="preserve">A warehouse must exist in ERPNext for the company</w:t>
+              <w:t xml:space="preserve">A warehouse must exist in NestERP for the company</w:t>
             </w:r>
           </w:p>
         </w:tc>
@@ -815,7 +853,7 @@
           <w:sz w:val="22"/>
           <w:szCs w:val="22"/>
         </w:rPr>
-        <w:t xml:space="preserve">Navigate to: ERPNext → Erpnext Sbca Settings. The page is divided into four tabs.</w:t>
+        <w:t xml:space="preserve">Navigate to: NestERP → Erpnext Sbca Settings. The page is divided into four tabs.</w:t>
       </w:r>
     </w:p>
     <w:p>
@@ -890,7 +928,7 @@
           <w:sz w:val="22"/>
           <w:szCs w:val="22"/>
         </w:rPr>
-        <w:t xml:space="preserve">Pharoh URL</w:t>
+        <w:t xml:space="preserve">NestERP API URL</w:t>
       </w:r>
     </w:p>
     <w:p>
@@ -904,7 +942,7 @@
           <w:sz w:val="22"/>
           <w:szCs w:val="22"/>
         </w:rPr>
-        <w:t xml:space="preserve">The base URL for the Pharoh middleware. All API calls are made to this address. Enter it without a trailing slash.</w:t>
+        <w:t xml:space="preserve">The base URL for the NestERP API middleware. All API calls are made to this address. Enter it without a trailing slash.</w:t>
       </w:r>
     </w:p>
     <w:p>
@@ -920,7 +958,7 @@
           <w:sz w:val="22"/>
           <w:szCs w:val="22"/>
         </w:rPr>
-        <w:t xml:space="preserve">Example: https://pharoh.clientdomain.co.za</w:t>
+        <w:t xml:space="preserve">Example: https://nesterp-api.clientdomain.co.za</w:t>
       </w:r>
     </w:p>
     <w:p>
@@ -1172,7 +1210,7 @@
                 <w:sz w:val="20"/>
                 <w:szCs w:val="20"/>
               </w:rPr>
-              <w:t xml:space="preserve">Imports Sage item categories as ERPNext Item Groups</w:t>
+              <w:t xml:space="preserve">Imports Sage item categories as NestERP Item Groups</w:t>
             </w:r>
           </w:p>
         </w:tc>
@@ -1267,7 +1305,7 @@
                 <w:sz w:val="20"/>
                 <w:szCs w:val="20"/>
               </w:rPr>
-              <w:t xml:space="preserve">Imports the full Sage item catalogue into ERPNext</w:t>
+              <w:t xml:space="preserve">Imports the full Sage item catalogue into NestERP</w:t>
             </w:r>
           </w:p>
         </w:tc>
@@ -1552,7 +1590,7 @@
                 <w:sz w:val="20"/>
                 <w:szCs w:val="20"/>
               </w:rPr>
-              <w:t xml:space="preserve">Updates ERPNext stock quantities from Sage</w:t>
+              <w:t xml:space="preserve">Updates NestERP stock quantities from Sage</w:t>
             </w:r>
           </w:p>
         </w:tc>
@@ -1742,7 +1780,7 @@
                 <w:sz w:val="20"/>
                 <w:szCs w:val="20"/>
               </w:rPr>
-              <w:t xml:space="preserve">Imports Sage suppliers as ERPNext Suppliers</w:t>
+              <w:t xml:space="preserve">Imports Sage suppliers as NestERP Suppliers</w:t>
             </w:r>
           </w:p>
         </w:tc>
@@ -1932,7 +1970,7 @@
                 <w:sz w:val="20"/>
                 <w:szCs w:val="20"/>
               </w:rPr>
-              <w:t xml:space="preserve">Imports Sage customers as ERPNext Customers</w:t>
+              <w:t xml:space="preserve">Imports Sage customers as NestERP Customers</w:t>
             </w:r>
           </w:p>
         </w:tc>
@@ -2122,7 +2160,7 @@
                 <w:sz w:val="20"/>
                 <w:szCs w:val="20"/>
               </w:rPr>
-              <w:t xml:space="preserve">Pulls open Sales Orders from Sage into ERPNext</w:t>
+              <w:t xml:space="preserve">Pulls open Sales Orders from Sage into NestERP</w:t>
             </w:r>
           </w:p>
         </w:tc>
@@ -2217,7 +2255,7 @@
                 <w:sz w:val="20"/>
                 <w:szCs w:val="20"/>
               </w:rPr>
-              <w:t xml:space="preserve">Pulls open Purchase Orders from Sage into ERPNext</w:t>
+              <w:t xml:space="preserve">Pulls open Purchase Orders from Sage into NestERP</w:t>
             </w:r>
           </w:p>
         </w:tc>
@@ -2312,7 +2350,7 @@
                 <w:sz w:val="20"/>
                 <w:szCs w:val="20"/>
               </w:rPr>
-              <w:t xml:space="preserve">Pushes price changes made in ERPNext back to Sage</w:t>
+              <w:t xml:space="preserve">Pushes price changes made in NestERP back to Sage</w:t>
             </w:r>
           </w:p>
         </w:tc>
@@ -2597,7 +2635,7 @@
                 <w:sz w:val="20"/>
                 <w:szCs w:val="20"/>
               </w:rPr>
-              <w:t xml:space="preserve">Sends a new SO to Sage when submitted in ERPNext</w:t>
+              <w:t xml:space="preserve">Sends a new SO to Sage when submitted in NestERP</w:t>
             </w:r>
           </w:p>
         </w:tc>
@@ -2692,7 +2730,7 @@
                 <w:sz w:val="20"/>
                 <w:szCs w:val="20"/>
               </w:rPr>
-              <w:t xml:space="preserve">Sends a new PO to Sage when submitted in ERPNext</w:t>
+              <w:t xml:space="preserve">Sends a new PO to Sage when submitted in NestERP</w:t>
             </w:r>
           </w:p>
         </w:tc>
@@ -3153,7 +3191,7 @@
           <w:sz w:val="22"/>
           <w:szCs w:val="22"/>
         </w:rPr>
-        <w:t xml:space="preserve">A child table with one row per ERPNext Company that needs to sync with Sage. Each row holds the credentials and settings for one company. Click the pencil icon on a row to edit all fields.</w:t>
+        <w:t xml:space="preserve">A child table with one row per NestERP Company that needs to sync with Sage. Each row holds the credentials and settings for one company. Click the pencil icon on a row to edit all fields.</w:t>
       </w:r>
     </w:p>
     <w:p>
@@ -3221,7 +3259,7 @@
           <w:sz w:val="22"/>
           <w:szCs w:val="22"/>
         </w:rPr>
-        <w:t xml:space="preserve">These tabs are used after the initial sync has run and accounts have been imported. They are used to map Sage accounts to ERPNext accounts and configure tax types. Leave these until the Connection tab is fully configured and the first account sync has completed.</w:t>
+        <w:t xml:space="preserve">These tabs are used after the initial sync has run and accounts have been imported. They are used to map Sage accounts to NestERP accounts and configure tax types. Leave these until the Connection tab is fully configured and the first account sync has completed.</w:t>
       </w:r>
     </w:p>
     <w:p>
@@ -3496,7 +3534,7 @@
                 <w:sz w:val="20"/>
                 <w:szCs w:val="20"/>
               </w:rPr>
-              <w:t xml:space="preserve">Link to the ERPNext Company this row applies to. Must exist before setup.</w:t>
+              <w:t xml:space="preserve">Link to the NestERP Company this row applies to. Must exist before setup.</w:t>
             </w:r>
           </w:p>
         </w:tc>
@@ -4541,7 +4579,7 @@
                 <w:sz w:val="20"/>
                 <w:szCs w:val="20"/>
               </w:rPr>
-              <w:t xml:space="preserve">The ERPNext warehouse where imported SO and PO items will be assigned. Must exist in ERPNext and belong to this company.</w:t>
+              <w:t xml:space="preserve">The NestERP warehouse where imported SO and PO items will be assigned. Must exist in NestERP and belong to this company.</w:t>
             </w:r>
           </w:p>
         </w:tc>
@@ -5292,7 +5330,7 @@
                 <w:sz w:val="22"/>
                 <w:szCs w:val="22"/>
               </w:rPr>
-              <w:t xml:space="preserve">Pharoh middleware is deployed and the swagger page loads</w:t>
+              <w:t xml:space="preserve">NestERP API middleware is deployed and the swagger page loads</w:t>
             </w:r>
           </w:p>
         </w:tc>
@@ -5323,7 +5361,7 @@
                 <w:sz w:val="20"/>
                 <w:szCs w:val="20"/>
               </w:rPr>
-              <w:t xml:space="preserve">Visit /swagger/index.html on the Pharoh URL</w:t>
+              <w:t xml:space="preserve">Visit /swagger/index.html on the NestERP API URL</w:t>
             </w:r>
           </w:p>
         </w:tc>
@@ -5388,7 +5426,7 @@
                 <w:sz w:val="22"/>
                 <w:szCs w:val="22"/>
               </w:rPr>
-              <w:t xml:space="preserve">ERPNext Company record exists for this client</w:t>
+              <w:t xml:space="preserve">NestERP Company record exists for this client</w:t>
             </w:r>
           </w:p>
         </w:tc>
@@ -5484,7 +5522,7 @@
                 <w:sz w:val="22"/>
                 <w:szCs w:val="22"/>
               </w:rPr>
-              <w:t xml:space="preserve">At least one Warehouse exists for the company in ERPNext</w:t>
+              <w:t xml:space="preserve">At least one Warehouse exists for the company in NestERP</w:t>
             </w:r>
           </w:p>
         </w:tc>
@@ -5921,7 +5959,7 @@
                 <w:sz w:val="22"/>
                 <w:szCs w:val="22"/>
               </w:rPr>
-              <w:t xml:space="preserve">Enter the Pharoh base URL in the URL field</w:t>
+              <w:t xml:space="preserve">Enter the NestERP API base URL in the URL field</w:t>
             </w:r>
           </w:p>
         </w:tc>
@@ -6178,7 +6216,7 @@
                 <w:sz w:val="22"/>
                 <w:szCs w:val="22"/>
               </w:rPr>
-              <w:t xml:space="preserve">Set Company to the ERPNext Company</w:t>
+              <w:t xml:space="preserve">Set Company to the NestERP Company</w:t>
             </w:r>
           </w:p>
         </w:tc>
@@ -7674,7 +7712,7 @@
                 <w:sz w:val="22"/>
                 <w:szCs w:val="22"/>
               </w:rPr>
-              <w:t xml:space="preserve">Confirm you are redirected back to ERPNext</w:t>
+              <w:t xml:space="preserve">Confirm you are redirected back to NestERP</w:t>
             </w:r>
           </w:p>
         </w:tc>
@@ -8416,7 +8454,7 @@
                 <w:sz w:val="22"/>
                 <w:szCs w:val="22"/>
               </w:rPr>
-              <w:t xml:space="preserve">Wait one scheduler cycle (~4 minutes) and confirm groups appear in ERPNext</w:t>
+              <w:t xml:space="preserve">Wait one scheduler cycle (~4 minutes) and confirm groups appear in NestERP</w:t>
             </w:r>
           </w:p>
         </w:tc>
@@ -9379,7 +9417,7 @@
                 <w:sz w:val="22"/>
                 <w:szCs w:val="22"/>
               </w:rPr>
-              <w:t xml:space="preserve">Confirm SOs and POs appear in ERPNext</w:t>
+              <w:t xml:space="preserve">Confirm SOs and POs appear in NestERP</w:t>
             </w:r>
           </w:p>
         </w:tc>
@@ -9463,7 +9501,7 @@
           <w:sz w:val="22"/>
           <w:szCs w:val="22"/>
         </w:rPr>
-        <w:t xml:space="preserve">Enable push triggers only after the pull sync has been confirmed working. Enable only the document types the client will be processing through ERPNext.</w:t>
+        <w:t xml:space="preserve">Enable push triggers only after the pull sync has been confirmed working. Enable only the document types the client will be processing through NestERP.</w:t>
       </w:r>
     </w:p>
     <w:p>
@@ -9677,7 +9715,7 @@
                 <w:sz w:val="20"/>
                 <w:szCs w:val="20"/>
               </w:rPr>
-              <w:t xml:space="preserve">If client raises SOs in ERPNext</w:t>
+              <w:t xml:space="preserve">If client raises SOs in NestERP</w:t>
             </w:r>
           </w:p>
         </w:tc>
@@ -9773,7 +9811,7 @@
                 <w:sz w:val="20"/>
                 <w:szCs w:val="20"/>
               </w:rPr>
-              <w:t xml:space="preserve">If client raises POs in ERPNext</w:t>
+              <w:t xml:space="preserve">If client raises POs in NestERP</w:t>
             </w:r>
           </w:p>
         </w:tc>
@@ -9869,7 +9907,7 @@
                 <w:sz w:val="20"/>
                 <w:szCs w:val="20"/>
               </w:rPr>
-              <w:t xml:space="preserve">If client invoices through ERPNext</w:t>
+              <w:t xml:space="preserve">If client invoices through NestERP</w:t>
             </w:r>
           </w:p>
         </w:tc>
@@ -9965,7 +10003,7 @@
                 <w:sz w:val="20"/>
                 <w:szCs w:val="20"/>
               </w:rPr>
-              <w:t xml:space="preserve">If client processes supplier invoices in ERPNext</w:t>
+              <w:t xml:space="preserve">If client processes supplier invoices in NestERP</w:t>
             </w:r>
           </w:p>
         </w:tc>
@@ -10222,7 +10260,7 @@
                 <w:sz w:val="22"/>
                 <w:szCs w:val="22"/>
               </w:rPr>
-              <w:t xml:space="preserve">Test each enabled push by submitting a test document in ERPNext</w:t>
+              <w:t xml:space="preserve">Test each enabled push by submitting a test document in NestERP</w:t>
             </w:r>
           </w:p>
         </w:tc>
@@ -10851,7 +10889,7 @@
                 <w:sz w:val="22"/>
                 <w:szCs w:val="22"/>
               </w:rPr>
-              <w:t xml:space="preserve">Walk client accountant through the Sage ↔ ERPNext Accounting Sync Guide</w:t>
+              <w:t xml:space="preserve">Walk client accountant through the Sage ↔ NestERP Accounting Sync Guide</w:t>
             </w:r>
           </w:p>
         </w:tc>
@@ -10947,7 +10985,7 @@
                 <w:sz w:val="22"/>
                 <w:szCs w:val="22"/>
               </w:rPr>
-              <w:t xml:space="preserve">Confirm client knows: stock items must originate in ERPNext</w:t>
+              <w:t xml:space="preserve">Confirm client knows: stock items must originate in NestERP</w:t>
             </w:r>
           </w:p>
         </w:tc>
@@ -11074,7 +11112,7 @@
                 <w:sz w:val="20"/>
                 <w:szCs w:val="20"/>
               </w:rPr>
-              <w:t xml:space="preserve">ERPNext is reconciled monthly</w:t>
+              <w:t xml:space="preserve">NestERP is reconciled monthly</w:t>
             </w:r>
           </w:p>
         </w:tc>
@@ -11684,7 +11722,7 @@
                 <w:sz w:val="20"/>
                 <w:szCs w:val="20"/>
               </w:rPr>
-              <w:t xml:space="preserve">The customer in ERPNext does not have a custom_sage_customer_id. Run a customer pull first.</w:t>
+              <w:t xml:space="preserve">The customer in NestERP does not have a custom_sage_customer_id. Run a customer pull first.</w:t>
             </w:r>
           </w:p>
         </w:tc>
@@ -12490,7 +12528,7 @@
                 <w:sz w:val="20"/>
                 <w:szCs w:val="20"/>
               </w:rPr>
-              <w:t xml:space="preserve">Fresh site — clean ERPNext data</w:t>
+              <w:t xml:space="preserve">Fresh site — clean NestERP data</w:t>
             </w:r>
           </w:p>
         </w:tc>
@@ -12586,7 +12624,7 @@
                 <w:sz w:val="20"/>
                 <w:szCs w:val="20"/>
               </w:rPr>
-              <w:t xml:space="preserve">Toggles, Pharoh URL, Last Order Sync Date</w:t>
+              <w:t xml:space="preserve">Toggles, NestERP API URL, Last Order Sync Date</w:t>
             </w:r>
           </w:p>
         </w:tc>
@@ -12651,7 +12689,7 @@
                 <w:sz w:val="22"/>
                 <w:szCs w:val="22"/>
               </w:rPr>
-              <w:t xml:space="preserve">Add a new Company Sage Integration row for the live ERPNext Company</w:t>
+              <w:t xml:space="preserve">Add a new Company Sage Integration row for the live NestERP Company</w:t>
             </w:r>
           </w:p>
         </w:tc>
@@ -12874,7 +12912,7 @@
                 <w:sz w:val="20"/>
                 <w:szCs w:val="20"/>
               </w:rPr>
-              <w:t xml:space="preserve">Must exist in the live ERPNext site</w:t>
+              <w:t xml:space="preserve">Must exist in the live NestERP site</w:t>
             </w:r>
           </w:p>
         </w:tc>
@@ -13689,7 +13727,7 @@
         <w:sz w:val="18"/>
         <w:szCs w:val="18"/>
       </w:rPr>
-      <w:t xml:space="preserve">ERPNext SBCA — New Client Setup Guide</w:t>
+      <w:t xml:space="preserve">NestERP SBCA — New Client Setup Guide</w:t>
     </w:r>
     <w:r>
       <w:rPr>

</xml_diff>